<commit_message>
Revise handover doc as shared build notes
Reframe document as idea/build documentation shared with a friend; remove co-maintainer framing.

Co-authored-by: Cursor <cursoragent@cursor.com>
</commit_message>
<xml_diff>
--- a/docs/handover/VIIRS_Maintainer_Handover.docx
+++ b/docs/handover/VIIRS_Maintainer_Handover.docx
@@ -7,7 +7,7 @@
         <w:pStyle w:val="Title"/>
       </w:pPr>
       <w:r>
-        <w:t>VIIRS Nightlights Analysis Tool — Maintainer Handover (Co-maintainer)</w:t>
+        <w:t>VIIRS Nightlights Analysis Tool — Idea &amp; Build Notes (Shared)</w:t>
       </w:r>
     </w:p>
     <w:p>
@@ -30,7 +30,7 @@
     </w:p>
     <w:p>
       <w:r>
-        <w:t>This document enables a clean, repeatable handover so a co-maintainer can safely operate, extend, and (if needed) deploy the project as an open-source repository.</w:t>
+        <w:t>This document is a lightweight, shareable record of the idea, architecture, and build steps for the tool. It is meant to help a friend (and future contributors) understand how to build and run the project so that researchers can quickly retrieve VIIRS data and download reports.</w:t>
       </w:r>
     </w:p>
     <w:p>
@@ -38,7 +38,7 @@
         <w:pStyle w:val="Heading1"/>
       </w:pPr>
       <w:r>
-        <w:t>2) Maintainers &amp; roles</w:t>
+        <w:t>2) People (idea shared)</w:t>
       </w:r>
     </w:p>
     <w:p>
@@ -46,7 +46,7 @@
         <w:pStyle w:val="ListBullet"/>
       </w:pPr>
       <w:r>
-        <w:t>Primary maintainer: Divya Sornaraja (GitHub: @dso6060)</w:t>
+        <w:t>Primary author: Divya Sornaraja (GitHub: @dso6060)</w:t>
       </w:r>
     </w:p>
     <w:p>
@@ -54,7 +54,7 @@
         <w:pStyle w:val="ListBullet"/>
       </w:pPr>
       <w:r>
-        <w:t>Co-maintainer: Ayush Patnaik (GitHub: @ayushpatnaikgit)</w:t>
+        <w:t>Friend (idea/build notes shared): Ayush Patnaik (GitHub: @ayushpatnaikgit)</w:t>
       </w:r>
     </w:p>
     <w:p>
@@ -62,7 +62,7 @@
         <w:pStyle w:val="ListBullet"/>
       </w:pPr>
       <w:r>
-        <w:t>Target co-maintainer permission: Admin (full control).</w:t>
+        <w:t>This is not a formal maintainer handoff. GitHub permissions can remain minimal unless needed later.</w:t>
       </w:r>
     </w:p>
     <w:p>
@@ -144,7 +144,7 @@
         <w:pStyle w:val="ListBullet"/>
       </w:pPr>
       <w:r>
-        <w:t>Enable caching/preprocessing for fast repeated queries and predictable server costs.</w:t>
+        <w:t>Enable fast, repeatable downloads and report-ready outputs for researchers.</w:t>
       </w:r>
     </w:p>
     <w:p>
@@ -182,6 +182,35 @@
       </w:pPr>
       <w:r>
         <w:t>Docker Compose + nginx reverse proxy (VPS-friendly).</w:t>
+      </w:r>
+    </w:p>
+    <w:p>
+      <w:r>
+        <w:t>Future scope (optional, later improvements):</w:t>
+      </w:r>
+    </w:p>
+    <w:p>
+      <w:pPr>
+        <w:pStyle w:val="ListBullet"/>
+      </w:pPr>
+      <w:r>
+        <w:t>More precise spatial masking using real city boundaries (shapefiles/OSM polygons) instead of radius/bounding-box approximations.</w:t>
+      </w:r>
+    </w:p>
+    <w:p>
+      <w:pPr>
+        <w:pStyle w:val="ListBullet"/>
+      </w:pPr>
+      <w:r>
+        <w:t>A dedicated report generator (downloadable artifacts) tailored for research workflows (tables, charts, citations, reproducibility metadata).</w:t>
+      </w:r>
+    </w:p>
+    <w:p>
+      <w:pPr>
+        <w:pStyle w:val="ListBullet"/>
+      </w:pPr>
+      <w:r>
+        <w:t>A more advanced visualization UI if researchers need publication-grade exploratory tooling.</w:t>
       </w:r>
     </w:p>
     <w:p>
@@ -476,20 +505,12 @@
         <w:pStyle w:val="Heading1"/>
       </w:pPr>
       <w:r>
-        <w:t>8) Co-maintainer (Admin) handover steps</w:t>
+        <w:t>8) Sharing process with a friend (optional GitHub access)</w:t>
       </w:r>
     </w:p>
     <w:p>
       <w:r>
-        <w:t>Steps for Divya to grant Admin access to Ayush on GitHub:</w:t>
-      </w:r>
-    </w:p>
-    <w:p>
-      <w:pPr>
-        <w:pStyle w:val="ListNumber"/>
-      </w:pPr>
-      <w:r>
-        <w:t>Create the GitHub repository (if not already created).</w:t>
+        <w:t>If you want your friend to contribute directly via GitHub, you can add them as a collaborator later. This document does not assume any specific role (co-maintainer/admin).</w:t>
       </w:r>
     </w:p>
     <w:p>
@@ -505,7 +526,7 @@
         <w:pStyle w:val="ListNumber"/>
       </w:pPr>
       <w:r>
-        <w:t>Invite Ayush by GitHub username and set role to Admin.</w:t>
+        <w:t>Invite your friend by GitHub username.</w:t>
       </w:r>
     </w:p>
     <w:p>
@@ -513,15 +534,7 @@
         <w:pStyle w:val="ListNumber"/>
       </w:pPr>
       <w:r>
-        <w:t>Ask Ayush to accept the invitation.</w:t>
-      </w:r>
-    </w:p>
-    <w:p>
-      <w:pPr>
-        <w:pStyle w:val="ListNumber"/>
-      </w:pPr>
-      <w:r>
-        <w:t>Optional: enable branch protection rules (e.g., require PR reviews) once stable.</w:t>
+        <w:t>Start with the least privilege needed (e.g., Write). Increase later if needed.</w:t>
       </w:r>
     </w:p>
     <w:p>
@@ -534,7 +547,7 @@
     </w:p>
     <w:p>
       <w:r>
-        <w:t>You confirmed you want to include the current DB files in the repo. Downsides to be aware of:</w:t>
+        <w:t>For open source, avoid committing real datasets or large databases. Downsides to be aware of:</w:t>
       </w:r>
     </w:p>
     <w:p>
@@ -661,7 +674,7 @@
         <w:pStyle w:val="ListBullet"/>
       </w:pPr>
       <w:r>
-        <w:t>Dependency management: backend/requirements.txt is currently empty; add pinned dependencies for reproducible installs.</w:t>
+        <w:t>Dependency management: keep backend/requirements.txt pinned for reproducible installs.</w:t>
       </w:r>
     </w:p>
     <w:p>

</xml_diff>